<commit_message>
fix(sample_documents): case conference decisions/actions as narrative, not a table
Review found the brief required narrative decisions/actions paragraphs for
build_case_conference_note (like the Discussion section above it), not a
second grid table. Rewrote the section as prose covering the same
who/what/when content and regenerated 07_case_conference_note.docx.
</commit_message>
<xml_diff>
--- a/sample_documents/07_case_conference_note.docx
+++ b/sample_documents/07_case_conference_note.docx
@@ -402,251 +402,11 @@
         <w:t>Decisions / Actions</w:t>
       </w:r>
     </w:p>
-    <w:tbl>
-      <w:tblPr>
-        <w:tblStyle w:val="TableGrid"/>
-        <w:tblW w:type="auto" w:w="0"/>
-        <w:tblLook w:firstColumn="1" w:firstRow="1" w:lastColumn="0" w:lastRow="0" w:noHBand="0" w:noVBand="1" w:val="04A0"/>
-      </w:tblPr>
-      <w:tblGrid>
-        <w:gridCol w:w="2880"/>
-        <w:gridCol w:w="2880"/>
-        <w:gridCol w:w="2880"/>
-      </w:tblGrid>
-      <w:tr>
-        <w:tc>
-          <w:tcPr>
-            <w:tcW w:type="dxa" w:w="2880"/>
-          </w:tcPr>
-          <w:p>
-            <w:r>
-              <w:rPr>
-                <w:b/>
-              </w:rPr>
-              <w:t>Action</w:t>
-            </w:r>
-          </w:p>
-        </w:tc>
-        <w:tc>
-          <w:tcPr>
-            <w:tcW w:type="dxa" w:w="2880"/>
-          </w:tcPr>
-          <w:p>
-            <w:r>
-              <w:rPr>
-                <w:b/>
-              </w:rPr>
-              <w:t>Responsible</w:t>
-            </w:r>
-          </w:p>
-        </w:tc>
-        <w:tc>
-          <w:tcPr>
-            <w:tcW w:type="dxa" w:w="2880"/>
-          </w:tcPr>
-          <w:p>
-            <w:r>
-              <w:rPr>
-                <w:b/>
-              </w:rPr>
-              <w:t>Timeframe</w:t>
-            </w:r>
-          </w:p>
-        </w:tc>
-      </w:tr>
-      <w:tr>
-        <w:tc>
-          <w:tcPr>
-            <w:tcW w:type="dxa" w:w="2880"/>
-          </w:tcPr>
-          <w:p>
-            <w:r>
-              <w:t>Provide further review letter to enable extended Mental Health Care Plan sessions</w:t>
-            </w:r>
-          </w:p>
-        </w:tc>
-        <w:tc>
-          <w:tcPr>
-            <w:tcW w:type="dxa" w:w="2880"/>
-          </w:tcPr>
-          <w:p>
-            <w:r>
-              <w:t>Dr. Susan Ng</w:t>
-            </w:r>
-          </w:p>
-        </w:tc>
-        <w:tc>
-          <w:tcPr>
-            <w:tcW w:type="dxa" w:w="2880"/>
-          </w:tcPr>
-          <w:p>
-            <w:r>
-              <w:t>Within 1 week</w:t>
-            </w:r>
-          </w:p>
-        </w:tc>
-      </w:tr>
-      <w:tr>
-        <w:tc>
-          <w:tcPr>
-            <w:tcW w:type="dxa" w:w="2880"/>
-          </w:tcPr>
-          <w:p>
-            <w:r>
-              <w:t>Continue trauma-focused CBT with graded exposure, steps 2–6</w:t>
-            </w:r>
-          </w:p>
-        </w:tc>
-        <w:tc>
-          <w:tcPr>
-            <w:tcW w:type="dxa" w:w="2880"/>
-          </w:tcPr>
-          <w:p>
-            <w:r>
-              <w:t>Dr. Amelia Ferro</w:t>
-            </w:r>
-          </w:p>
-        </w:tc>
-        <w:tc>
-          <w:tcPr>
-            <w:tcW w:type="dxa" w:w="2880"/>
-          </w:tcPr>
-          <w:p>
-            <w:r>
-              <w:t>Ongoing, weekly</w:t>
-            </w:r>
-          </w:p>
-        </w:tc>
-      </w:tr>
-      <w:tr>
-        <w:tc>
-          <w:tcPr>
-            <w:tcW w:type="dxa" w:w="2880"/>
-          </w:tcPr>
-          <w:p>
-            <w:r>
-              <w:t>Complete functional capacity review ahead of floor-duty increase</w:t>
-            </w:r>
-          </w:p>
-        </w:tc>
-        <w:tc>
-          <w:tcPr>
-            <w:tcW w:type="dxa" w:w="2880"/>
-          </w:tcPr>
-          <w:p>
-            <w:r>
-              <w:t>Grace Tan</w:t>
-            </w:r>
-          </w:p>
-        </w:tc>
-        <w:tc>
-          <w:tcPr>
-            <w:tcW w:type="dxa" w:w="2880"/>
-          </w:tcPr>
-          <w:p>
-            <w:r>
-              <w:t>2 weeks</w:t>
-            </w:r>
-          </w:p>
-        </w:tc>
-      </w:tr>
-      <w:tr>
-        <w:tc>
-          <w:tcPr>
-            <w:tcW w:type="dxa" w:w="2880"/>
-          </w:tcPr>
-          <w:p>
-            <w:r>
-              <w:t>Approve extension of funded psychology sessions under claim</w:t>
-            </w:r>
-          </w:p>
-        </w:tc>
-        <w:tc>
-          <w:tcPr>
-            <w:tcW w:type="dxa" w:w="2880"/>
-          </w:tcPr>
-          <w:p>
-            <w:r>
-              <w:t>Marcus Delaney</w:t>
-            </w:r>
-          </w:p>
-        </w:tc>
-        <w:tc>
-          <w:tcPr>
-            <w:tcW w:type="dxa" w:w="2880"/>
-          </w:tcPr>
-          <w:p>
-            <w:r>
-              <w:t>Within 5 business days</w:t>
-            </w:r>
-          </w:p>
-        </w:tc>
-      </w:tr>
-      <w:tr>
-        <w:tc>
-          <w:tcPr>
-            <w:tcW w:type="dxa" w:w="2880"/>
-          </w:tcPr>
-          <w:p>
-            <w:r>
-              <w:t>Roster supervised floor-exposure sessions with familiar colleague</w:t>
-            </w:r>
-          </w:p>
-        </w:tc>
-        <w:tc>
-          <w:tcPr>
-            <w:tcW w:type="dxa" w:w="2880"/>
-          </w:tcPr>
-          <w:p>
-            <w:r>
-              <w:t>Helen Okafor / Adrian Cross</w:t>
-            </w:r>
-          </w:p>
-        </w:tc>
-        <w:tc>
-          <w:tcPr>
-            <w:tcW w:type="dxa" w:w="2880"/>
-          </w:tcPr>
-          <w:p>
-            <w:r>
-              <w:t>From next roster cycle</w:t>
-            </w:r>
-          </w:p>
-        </w:tc>
-      </w:tr>
-      <w:tr>
-        <w:tc>
-          <w:tcPr>
-            <w:tcW w:type="dxa" w:w="2880"/>
-          </w:tcPr>
-          <w:p>
-            <w:r>
-              <w:t>Schedule follow-up case conference to review progress</w:t>
-            </w:r>
-          </w:p>
-        </w:tc>
-        <w:tc>
-          <w:tcPr>
-            <w:tcW w:type="dxa" w:w="2880"/>
-          </w:tcPr>
-          <w:p>
-            <w:r>
-              <w:t>Dr. Amelia Ferro</w:t>
-            </w:r>
-          </w:p>
-        </w:tc>
-        <w:tc>
-          <w:tcPr>
-            <w:tcW w:type="dxa" w:w="2880"/>
-          </w:tcPr>
-          <w:p>
-            <w:r>
-              <w:t>8 weeks (mid-May 2026)</w:t>
-            </w:r>
-          </w:p>
-        </w:tc>
-      </w:tr>
-    </w:tbl>
+    <w:p>
+      <w:r>
+        <w:t>It was agreed that Dr Susan Ng would provide a further review letter to enable extended Mental Health Care Plan sessions within 1 week, and that Dr Amelia Ferro would continue trauma-focused CBT with graded exposure through steps 2–6 on an ongoing weekly basis. Grace Tan will complete a functional capacity review ahead of any increase in floor-duty hours within 2 weeks, and Marcus Delaney will approve the extension of funded psychology sessions under the claim within 5 business days. Helen Okafor and Adrian Cross will roster supervised floor-exposure sessions with a familiar colleague from the next roster cycle. A follow-up case conference will be scheduled by Dr Amelia Ferro in 8 weeks (mid-May 2026) to review progress against these actions.</w:t>
+      </w:r>
+    </w:p>
     <w:p/>
     <w:p>
       <w:pPr>

</xml_diff>